<commit_message>
Add ICA flywheel and wrong-funnel analysis
</commit_message>
<xml_diff>
--- a/ICA_Engineering_Design_Proposal1.docx
+++ b/ICA_Engineering_Design_Proposal1.docx
@@ -628,12 +628,35 @@
         <w:pStyle w:val="ICAHeading1"/>
       </w:pPr>
       <w:r>
-        <w:t>6. Evaluation package</w:t>
+        <w:t>6. Hidden baseline cost</w:t>
       </w:r>
     </w:p>
     <w:p>
       <w:r>
-        <w:t>The largest remaining credibility gap for ICA is empirical evidence. To address that, the repository now includes a benchmark prompt set, an evaluation protocol, and a sample reporting format.</w:t>
+        <w:t>A short first answer is not necessarily an efficient answer. In ambiguous prompts, a baseline system can choose the wrong interpretation, give a broad or misleading answer, and force the user into a correction funnel before the real issue is finally exposed.</w:t>
+      </w:r>
+    </w:p>
+    <w:p>
+      <w:r>
+        <w:t>This is not only a retry problem. It is a wrong-funnel problem. The user either spends turns arguing the model into discovering the ambiguous term, or leaves with a partially wrong answer without ever learning what caused the mismatch.</w:t>
+      </w:r>
+    </w:p>
+    <w:p>
+      <w:r>
+        <w:t>For that reason, ICA should be evaluated on tokens to resolved intent, definition-discovery turn, correction-funnel depth, and user correction burden, not just on the cost of the first assistant response.</w:t>
+      </w:r>
+    </w:p>
+    <w:p>
+      <w:pPr>
+        <w:pStyle w:val="ICAHeading1"/>
+      </w:pPr>
+      <w:r>
+        <w:t>7. Evaluation package</w:t>
+      </w:r>
+    </w:p>
+    <w:p>
+      <w:r>
+        <w:t>The repository now includes a benchmark prompt set, an evaluation protocol, a sample reporting format, and a first-pass pilot benchmark. The evaluation compares not only direct one-shot answers, but also direct answers followed by the repair funnel when the first answer misses the intended meaning.</w:t>
       </w:r>
     </w:p>
     <w:tbl>
@@ -743,10 +766,54 @@
           </w:p>
         </w:tc>
       </w:tr>
+      <w:tr>
+        <w:tc>
+          <w:tcPr>
+            <w:tcW w:type="dxa" w:w="4896"/>
+          </w:tcPr>
+          <w:p>
+            <w:r>
+              <w:t>eval/pilot_results.md</w:t>
+            </w:r>
+          </w:p>
+        </w:tc>
+        <w:tc>
+          <w:tcPr>
+            <w:tcW w:type="dxa" w:w="4896"/>
+          </w:tcPr>
+          <w:p>
+            <w:r>
+              <w:t>Human-readable first-pass pilot benchmark report.</w:t>
+            </w:r>
+          </w:p>
+        </w:tc>
+      </w:tr>
+      <w:tr>
+        <w:tc>
+          <w:tcPr>
+            <w:tcW w:type="dxa" w:w="4896"/>
+          </w:tcPr>
+          <w:p>
+            <w:r>
+              <w:t>eval/pilot_results.csv</w:t>
+            </w:r>
+          </w:p>
+        </w:tc>
+        <w:tc>
+          <w:tcPr>
+            <w:tcW w:type="dxa" w:w="4896"/>
+          </w:tcPr>
+          <w:p>
+            <w:r>
+              <w:t>Machine-readable pilot results table for analysis and reuse.</w:t>
+            </w:r>
+          </w:p>
+        </w:tc>
+      </w:tr>
     </w:tbl>
     <w:p>
       <w:r>
-        <w:t>Key primary metrics include total tokens per resolved task, retry count, latency to correct answer, human-rated correctness, clarity, and premise handling. Key counter-metrics include over-clarification rate, unnecessary clarification rate, false direct-answer rate, false refusal rate, and clarification bias.</w:t>
+        <w:t>Key primary metrics include first assistant-message tokens, total tokens to resolved intent, definition-discovery turn, retry count, correctness, clarity, and premise handling. Key counter-metrics include over-clarification rate, false direct-answer rate, silent-failure proxy, false refusal rate, and clarification bias.</w:t>
       </w:r>
     </w:p>
     <w:p>
@@ -754,7 +821,30 @@
         <w:pStyle w:val="ICAHeading1"/>
       </w:pPr>
       <w:r>
-        <w:t>7. Deployment guidance</w:t>
+        <w:t>8. Strategic implication</w:t>
+      </w:r>
+    </w:p>
+    <w:p>
+      <w:r>
+        <w:t>At large scale, ICA is not only a reliability pattern. It becomes a clarification data flywheel. Each ambiguous query, clarifier, user reply, and final outcome produces a structured intent-resolution trace that is more valuable than an ordinary chat log because it captures what the user actually meant.</w:t>
+      </w:r>
+    </w:p>
+    <w:p>
+      <w:r>
+        <w:t>Public OpenAI disclosures in 2026 describe ChatGPT as having more than 900 million weekly active users and more than 50 million consumer subscribers. At that scale, even rare ambiguity classes become common in absolute terms. A provider with that distribution can improve ambiguity detection, ask-vs-answer thresholds, neutral clarifier wording, risk handling, and future base-model behavior using real-world traces rather than only synthetic or expert-labeled data.</w:t>
+      </w:r>
+    </w:p>
+    <w:p>
+      <w:r>
+        <w:t>The architecture is copyable. The live, high-volume intent-resolution feedback loop is much harder to copy. That is why ICA can be understood not only as a UX improvement, but as a route by which market share becomes model-quality advantage.</w:t>
+      </w:r>
+    </w:p>
+    <w:p>
+      <w:pPr>
+        <w:pStyle w:val="ICAHeading1"/>
+      </w:pPr>
+      <w:r>
+        <w:t>9. Deployment guidance</w:t>
       </w:r>
     </w:p>
     <w:p>
@@ -772,12 +862,12 @@
         <w:pStyle w:val="ICAHeading1"/>
       </w:pPr>
       <w:r>
-        <w:t>8. Conclusion</w:t>
+        <w:t>10. Conclusion</w:t>
       </w:r>
     </w:p>
     <w:p>
       <w:r>
-        <w:t>ICA is a credible architecture pattern because it defines a control-layer problem that engineers can implement: infer intent hypotheses, quantify ambiguity, route by expected utility, narrow intent before generation when doing so is worth the cost, and build systems that are more precise, more reliable, easier to defend, and often cheaper to operate on ambiguous tasks.</w:t>
+        <w:t>ICA is a credible architecture pattern because it defines a control-layer problem that engineers can implement: infer intent hypotheses, quantify ambiguity, route by expected utility, narrow intent before generation when doing so is worth the cost, and build systems that are more precise, more reliable, easier to defend, and often cheaper to operate once wrong-funnel conversations are counted properly.</w:t>
       </w:r>
     </w:p>
     <w:p>
@@ -900,10 +990,72 @@
           </w:p>
         </w:tc>
       </w:tr>
+      <w:tr>
+        <w:tc>
+          <w:tcPr>
+            <w:tcW w:type="dxa" w:w="4896"/>
+          </w:tcPr>
+          <w:p>
+            <w:r>
+              <w:t>eval/pilot_results.md</w:t>
+            </w:r>
+          </w:p>
+        </w:tc>
+        <w:tc>
+          <w:tcPr>
+            <w:tcW w:type="dxa" w:w="4896"/>
+          </w:tcPr>
+          <w:p>
+            <w:r>
+              <w:t>Published first-pass pilot benchmark report.</w:t>
+            </w:r>
+          </w:p>
+        </w:tc>
+      </w:tr>
+      <w:tr>
+        <w:tc>
+          <w:tcPr>
+            <w:tcW w:type="dxa" w:w="4896"/>
+          </w:tcPr>
+          <w:p>
+            <w:r>
+              <w:t>eval/pilot_results.csv</w:t>
+            </w:r>
+          </w:p>
+        </w:tc>
+        <w:tc>
+          <w:tcPr>
+            <w:tcW w:type="dxa" w:w="4896"/>
+          </w:tcPr>
+          <w:p>
+            <w:r>
+              <w:t>Structured pilot dataset for re-analysis or extension.</w:t>
+            </w:r>
+          </w:p>
+        </w:tc>
+      </w:tr>
     </w:tbl>
     <w:p>
+      <w:pPr>
+        <w:pStyle w:val="ICAHeading2"/>
+      </w:pPr>
       <w:r>
-        <w:t>Recommended next move: run a 25-prompt pilot benchmark, publish the results using the template, and update the controller threshold and routing rules based on observed over-clarification, false direct-answer, and false-refusal rates.</w:t>
+        <w:t>Pilot signal snapshot</w:t>
+      </w:r>
+    </w:p>
+    <w:p>
+      <w:r>
+        <w:t>In the current 25-prompt pilot, direct first-pass answers required a repair funnel in 19 cases. On that same prompt set, ICA reduced mean definition-discovery turn from 2.6 to 1.0 and reduced mean total tokens to satisfactory resolution from 91.68 on the repaired baseline path to 78.04.</w:t>
+      </w:r>
+    </w:p>
+    <w:p>
+      <w:r>
+        <w:t>That is the narrower but stronger efficiency claim: early clarification is not always shorter than a one-shot answer, but it is often cheaper than discovering the same ambiguity after the system has already committed to the wrong semantic funnel.</w:t>
+      </w:r>
+    </w:p>
+    <w:p>
+      <w:r>
+        <w:t>Recommended next move: extend the single-rater pilot into a multi-rater or API-instrumented benchmark, then update the controller threshold and routing rules based on observed over-clarification, correction-funnel depth, silent-failure risk, false direct-answer, and false-refusal rates.</w:t>
       </w:r>
     </w:p>
     <w:sectPr>

</xml_diff>

<commit_message>
Polish ICA math and benchmark presentation
</commit_message>
<xml_diff>
--- a/ICA_Engineering_Design_Proposal1.docx
+++ b/ICA_Engineering_Design_Proposal1.docx
@@ -656,7 +656,7 @@
     </w:p>
     <w:p>
       <w:r>
-        <w:t>The repository now includes a benchmark prompt set, an evaluation protocol, a sample reporting format, and a first-pass pilot benchmark. The evaluation compares not only direct one-shot answers, but also direct answers followed by the repair funnel when the first answer misses the intended meaning.</w:t>
+        <w:t>The repository now includes a benchmark prompt set, an evaluation protocol, a sample reporting format, and a first-pass pilot benchmark. The evaluation compares not only direct one-shot answers, but also direct answers followed by the repair funnel when the first answer misses the intended meaning. The next credibility jump is a multi-rater or live-user benchmark.</w:t>
       </w:r>
     </w:p>
     <w:tbl>
@@ -1045,12 +1045,17 @@
     </w:p>
     <w:p>
       <w:r>
-        <w:t>In the current 25-prompt pilot, direct first-pass answers required a repair funnel in 19 cases. On that same prompt set, ICA reduced mean definition-discovery turn from 2.6 to 1.0 and reduced mean total tokens to satisfactory resolution from 91.68 on the repaired baseline path to 78.04.</w:t>
+        <w:t>In the current 25-prompt pilot, direct first-pass answers required a repair funnel in 19 cases. On that same prompt set, ICA reduced mean definition-discovery turn from 2.6 to 1.0 and reduced mean total tokens to satisfactory resolution from 71.68 on the repaired baseline path to 62.08.</w:t>
       </w:r>
     </w:p>
     <w:p>
       <w:r>
         <w:t>That is the narrower but stronger efficiency claim: early clarification is not always shorter than a one-shot answer, but it is often cheaper than discovering the same ambiguity after the system has already committed to the wrong semantic funnel.</w:t>
+      </w:r>
+    </w:p>
+    <w:p>
+      <w:r>
+        <w:t>In repaired-baseline scoring, final answer quality is equalized with ICA only when the baseline needed repair. The repaired utility score still penalizes extra repair tokens and retry burden so delayed clarification does not receive a free tie.</w:t>
       </w:r>
     </w:p>
     <w:p>

</xml_diff>

<commit_message>
Add ICA validation and reproduction notes
</commit_message>
<xml_diff>
--- a/ICA_Engineering_Design_Proposal1.docx
+++ b/ICA_Engineering_Design_Proposal1.docx
@@ -565,6 +565,11 @@
       </w:r>
     </w:p>
     <w:p>
+      <w:r>
+        <w:t>The repository also includes a lightweight schema validation check so the example can be tested against the contract rather than presented as a static mockup.</w:t>
+      </w:r>
+    </w:p>
+    <w:p>
       <w:pPr/>
       <w:r>
         <w:rPr>
@@ -657,6 +662,11 @@
     <w:p>
       <w:r>
         <w:t>The repository now includes a benchmark prompt set, an evaluation protocol, a sample reporting format, and a first-pass pilot benchmark. The evaluation compares not only direct one-shot answers, but also direct answers followed by the repair funnel when the first answer misses the intended meaning. The next credibility jump is a multi-rater or live-user benchmark.</w:t>
+      </w:r>
+    </w:p>
+    <w:p>
+      <w:r>
+        <w:t>The published pilot is designed to test ambiguous-prompt handling, not to estimate production-wide clarification frequency.</w:t>
       </w:r>
     </w:p>
     <w:tbl>
@@ -1060,6 +1070,11 @@
     </w:p>
     <w:p>
       <w:r>
+        <w:t>Reproduction path: validate the schema/example pair, run eval/build_pilot_report.py, inspect the generated CSV and Markdown report, then regenerate the proposal artifacts if needed.</w:t>
+      </w:r>
+    </w:p>
+    <w:p>
+      <w:r>
         <w:t>Recommended next move: extend the single-rater pilot into a multi-rater or API-instrumented benchmark, then update the controller threshold and routing rules based on observed over-clarification, correction-funnel depth, silent-failure risk, false direct-answer, and false-refusal rates.</w:t>
       </w:r>
     </w:p>

</xml_diff>

<commit_message>
Make local validation the canonical ICA workflow
</commit_message>
<xml_diff>
--- a/ICA_Engineering_Design_Proposal1.docx
+++ b/ICA_Engineering_Design_Proposal1.docx
@@ -566,7 +566,7 @@
     </w:p>
     <w:p>
       <w:r>
-        <w:t>The repository also includes a lightweight schema validation check so the example can be tested against the contract rather than presented as a static mockup.</w:t>
+        <w:t>The repository also includes a lightweight schema validation path so the example can be tested against the contract rather than presented as a static mockup. Local validation is the canonical reproducibility path; the workflow file is only an optional CI template.</w:t>
       </w:r>
     </w:p>
     <w:p>
@@ -1070,7 +1070,7 @@
     </w:p>
     <w:p>
       <w:r>
-        <w:t>Reproduction path: install dependencies from requirements.txt, or requirements.lock for a pinned replay, validate the schema/example pair, run eval/build_pilot_report.py, inspect the generated CSV and Markdown report, then regenerate the proposal artifacts if needed.</w:t>
+        <w:t>Reproduction path: install dependencies from requirements.txt, or requirements.lock for a pinned replay, run py_compile on the benchmark and artifact scripts, validate the schema/example pair, run eval/build_pilot_report.py, inspect the generated CSV and Markdown report, then regenerate the proposal artifacts if needed.</w:t>
       </w:r>
     </w:p>
     <w:p>

</xml_diff>

<commit_message>
Clarify pilot utility and calibration signals
</commit_message>
<xml_diff>
--- a/ICA_Engineering_Design_Proposal1.docx
+++ b/ICA_Engineering_Design_Proposal1.docx
@@ -874,7 +874,12 @@
     </w:p>
     <w:p>
       <w:r>
-        <w:t>The pilot utility proxy is transparent rather than implicit: quality equals the mean of correctness, clarity, and safety; utility_proxy equals quality minus 0.01 times total tokens minus 0.5 times retries. This proxy does not measure live satisfaction, abandonment, wall-clock latency, or revenue impact.</w:t>
+        <w:t>The pilot utility proxy is transparent rather than implicit: quality = (correctness + clarity + safety) / 3; utility_proxy = quality - 0.01 * total_tokens - 0.5 * retries. This proxy rewards judged final-answer quality and penalizes token cost and retry burden. It does not measure live satisfaction, abandonment, wall-clock latency, or revenue impact.</w:t>
+      </w:r>
+    </w:p>
+    <w:p>
+      <w:r>
+        <w:t>The current 25-prompt pilot is deliberately ambiguity-heavy and routes 20 of 25 prompts to ask_clarifier. That 80 percent clarification rate is defensible for a stress set, but it is not a desired production rate. On representative traffic, clarification rate, over-clarification rate, unnecessary clarification rate, and false direct-answer rate should become the primary tau-calibration signals.</w:t>
       </w:r>
     </w:p>
     <w:p>

</xml_diff>

<commit_message>
Add coding-agent extension bridge
</commit_message>
<xml_diff>
--- a/ICA_Engineering_Design_Proposal1.docx
+++ b/ICA_Engineering_Design_Proposal1.docx
@@ -935,7 +935,30 @@
         <w:pStyle w:val="ICAHeading1"/>
       </w:pPr>
       <w:r>
-        <w:t>11. Adversarial and deployment guidance</w:t>
+        <w:t>11. Future extension: coding agents</w:t>
+      </w:r>
+    </w:p>
+    <w:p>
+      <w:r>
+        <w:t>The same control-layer idea may apply to coding agents. In chat, ICA prevents the model from answering before intent is resolved. In agents, ICA can preserve the original task intent while filtering tool-output noise, failed attempts, and conversational drift across many steps.</w:t>
+      </w:r>
+    </w:p>
+    <w:p>
+      <w:r>
+        <w:t>For an agent, the compressed state packet might include the original user goal, current verified state, known constraints, failed attempts to avoid, and next best action. That packet can keep the model focused on the task state that matters rather than the full conversational residue.</w:t>
+      </w:r>
+    </w:p>
+    <w:p>
+      <w:r>
+        <w:t>This repository does not yet benchmark coding-agent performance. The extension is a natural, testable bridge from clarification-first chat to intent-preserving agent orchestration, with metrics such as tokens to green tests, repeated mistakes, time to resolution, final pass rate, unnecessary code churn, and preservation of original intent.</w:t>
+      </w:r>
+    </w:p>
+    <w:p>
+      <w:pPr>
+        <w:pStyle w:val="ICAHeading1"/>
+      </w:pPr>
+      <w:r>
+        <w:t>12. Adversarial and deployment guidance</w:t>
       </w:r>
     </w:p>
     <w:p>
@@ -958,7 +981,7 @@
         <w:pStyle w:val="ICAHeading1"/>
       </w:pPr>
       <w:r>
-        <w:t>12. Conclusion</w:t>
+        <w:t>13. Conclusion</w:t>
       </w:r>
     </w:p>
     <w:p>

</xml_diff>

<commit_message>
Position ICA as an intent control plane
</commit_message>
<xml_diff>
--- a/ICA_Engineering_Design_Proposal1.docx
+++ b/ICA_Engineering_Design_Proposal1.docx
@@ -19,7 +19,7 @@
         <w:pStyle w:val="ICASubtitle"/>
       </w:pPr>
       <w:r>
-        <w:t>A Clarification-First Control Layer for Reliable LLM Systems</w:t>
+        <w:t>A Control Plane for Intent in Reliable LLM Systems</w:t>
       </w:r>
     </w:p>
     <w:p>
@@ -145,7 +145,7 @@
         <w:jc w:val="left"/>
       </w:pPr>
       <w:r>
-        <w:t>Executive summary. ICA is a pre-generation control layer that decides whether clarification is worth the cost before the model commits to an answer. It treats ambiguity as uncertainty over latent user intent, estimates expected utility over possible clarification replies, and routes the request to direct answer, clarifier, premise-check, or refusal/redirect as appropriate.</w:t>
+        <w:t>Executive summary. ICA is a pre-generation control layer and control plane for intent. It decides whether clarification is worth the cost before the model commits to an answer or an agent action. It treats ambiguity as uncertainty over latent user intent, estimates expected utility over possible clarification replies, and routes the request to direct answer, clarifier, premise-check, or refusal/redirect as appropriate.</w:t>
       </w:r>
     </w:p>
     <w:p>
@@ -945,12 +945,17 @@
     </w:p>
     <w:p>
       <w:r>
+        <w:t>In that framing, ICA becomes a control plane for agentic systems. It does not replace the model's reasoning or tool use; it governs the state the model should reason over: original goal, verified facts, current constraints, failed paths, and the next useful action.</w:t>
+      </w:r>
+    </w:p>
+    <w:p>
+      <w:r>
         <w:t>For an agent, the compressed state packet might include the original user goal, current verified state, known constraints, failed attempts to avoid, and next best action. That packet can keep the model focused on the task state that matters rather than the full conversational residue.</w:t>
       </w:r>
     </w:p>
     <w:p>
       <w:r>
-        <w:t>This repository does not yet benchmark coding-agent performance. The extension is a natural, testable bridge from clarification-first chat to intent-preserving agent orchestration, with metrics such as tokens to green tests, repeated mistakes, time to resolution, final pass rate, unnecessary code churn, and preservation of original intent.</w:t>
+        <w:t>This repository does not yet benchmark coding-agent performance. The extension is a natural, testable bridge from clarification-first chat to intent-preserving agent orchestration, with metrics such as tokens to green tests, repeated mistakes, time to resolution, final pass rate, unnecessary code churn, and preservation of original intent. If validated on coding-agent benchmarks, this could improve agent unit economics by reducing repeated context, failed loops, and intent drift.</w:t>
       </w:r>
     </w:p>
     <w:p>
@@ -1211,7 +1216,7 @@
         <w:color w:val="5B6470"/>
         <w:sz w:val="16"/>
       </w:rPr>
-      <w:t>Paul Maddison | Clarification-first control layer for reliable LLM systems</w:t>
+      <w:t>Paul Maddison | Control plane for intent in reliable LLM systems</w:t>
     </w:r>
   </w:p>
 </w:ftr>
@@ -1228,7 +1233,7 @@
         <w:color w:val="5B6470"/>
         <w:sz w:val="18"/>
       </w:rPr>
-      <w:t>Intent Compression Architecture | Engineering Design Proposal</w:t>
+      <w:t>Intent Compression Architecture | Control Plane for Intent</w:t>
     </w:r>
   </w:p>
 </w:hdr>

</xml_diff>

<commit_message>
Promote agentic control-plane framing
</commit_message>
<xml_diff>
--- a/ICA_Engineering_Design_Proposal1.docx
+++ b/ICA_Engineering_Design_Proposal1.docx
@@ -145,7 +145,7 @@
         <w:jc w:val="left"/>
       </w:pPr>
       <w:r>
-        <w:t>Executive summary. ICA is a pre-generation control layer and control plane for intent. It decides whether clarification is worth the cost before the model commits to an answer or an agent action. It treats ambiguity as uncertainty over latent user intent, estimates expected utility over possible clarification replies, and routes the request to direct answer, clarifier, premise-check, or refusal/redirect as appropriate.</w:t>
+        <w:t>Executive summary. ICA is a pre-generation control layer and control plane for intent. It decides whether clarification is worth the cost before the model commits to an answer or an agent action. In chat, this prevents premature first answers from becoming misleading evidence. In agentic workflows, the same idea can preserve the original goal while filtering tool-output noise, failed attempts, and conversational drift.</w:t>
       </w:r>
     </w:p>
     <w:p>
@@ -164,6 +164,16 @@
     <w:p>
       <w:r>
         <w:t>ICA inserts a control layer between user input and final generation. The layer estimates likely intent hypotheses, scores ambiguity and risk, and decides whether clarification improves the expected outcome enough to justify the extra turn.</w:t>
+      </w:r>
+    </w:p>
+    <w:p>
+      <w:r>
+        <w:t>The same failure becomes more expensive in agents. In a coding agent, unresolved or drifting intent can produce wrong edits, repeated failed fixes, noisy tool loops, and expensive context growth. ICA frames this as an intent-control problem rather than merely a larger-context problem.</w:t>
+      </w:r>
+    </w:p>
+    <w:p>
+      <w:r>
+        <w:t>That makes the agentic use case economically important: a drifted coding agent does not only spend extra tokens, it spends extra tokens taking the wrong actions. A compact task-state packet can reduce both tokens per step and wasted steps.</w:t>
       </w:r>
     </w:p>
     <w:p>

</xml_diff>

<commit_message>
Strengthen ICA intent-control thesis
</commit_message>
<xml_diff>
--- a/ICA_Engineering_Design_Proposal1.docx
+++ b/ICA_Engineering_Design_Proposal1.docx
@@ -145,7 +145,7 @@
         <w:jc w:val="left"/>
       </w:pPr>
       <w:r>
-        <w:t>Executive summary. ICA is a pre-generation control layer and control plane for intent. It decides whether clarification is worth the cost before the model commits to an answer or an agent action. In chat, this prevents premature first answers from becoming misleading evidence. In agentic workflows, the same idea can preserve the original goal while filtering tool-output noise, failed attempts, and conversational drift.</w:t>
+        <w:t>Executive summary. ICA is a control plane for intent. It sits before generation or agent action and prevents unresolved intent from becoming the first answer, the wrong edit, the repeated tool loop, or the screenshot someone uses as evidence. The central claim is that LLM systems need better intent control, not only bigger context windows.</w:t>
       </w:r>
     </w:p>
     <w:p>
@@ -158,12 +158,17 @@
     </w:p>
     <w:p>
       <w:r>
-        <w:t>A common failure mode in LLM systems is unresolved ambiguity. Users often ask questions that admit multiple plausible interpretations, while the system is optimized to answer immediately. The result is a broad first answer, a user correction, and an unnecessary second pass.</w:t>
+        <w:t>ICA changes the default posture of an LLM system from answer-first to intent-first. It turns ambiguity into a measured control signal, clarification into an expected-utility decision, interaction history into compact state, user corrections into structured intent-resolution data, and the first answer into the outcome of a routing policy rather than an unverified guess.</w:t>
       </w:r>
     </w:p>
     <w:p>
       <w:r>
-        <w:t>ICA inserts a control layer between user input and final generation. The layer estimates likely intent hypotheses, scores ambiguity and risk, and decides whether clarification improves the expected outcome enough to justify the extra turn.</w:t>
+        <w:t>A common failure mode in LLM systems is unresolved intent. Users ask questions that admit multiple plausible interpretations, while the system is optimized to answer immediately. The result is a broad first answer, a misleading first answer, a user correction, or no correction at all because the user leaves.</w:t>
+      </w:r>
+    </w:p>
+    <w:p>
+      <w:r>
+        <w:t>ICA inserts a control layer between user input and final generation or action. The layer estimates likely intent hypotheses, scores ambiguity and risk, and decides whether clarification improves the expected outcome enough to justify the extra turn.</w:t>
       </w:r>
     </w:p>
     <w:p>
@@ -173,7 +178,7 @@
     </w:p>
     <w:p>
       <w:r>
-        <w:t>That makes the agentic use case economically important: a drifted coding agent does not only spend extra tokens, it spends extra tokens taking the wrong actions. A compact task-state packet can reduce both tokens per step and wasted steps.</w:t>
+        <w:t>That makes the agentic use case economically important: a drifted coding agent does not only spend extra tokens, it spends extra tokens taking the wrong actions. A compact task-state packet attacks both costs at once: fewer tokens per step and fewer wasted steps.</w:t>
       </w:r>
     </w:p>
     <w:p>
@@ -945,17 +950,17 @@
         <w:pStyle w:val="ICAHeading1"/>
       </w:pPr>
       <w:r>
-        <w:t>11. Future extension: coding agents</w:t>
+        <w:t>11. ICA for coding agents</w:t>
       </w:r>
     </w:p>
     <w:p>
       <w:r>
-        <w:t>The same control-layer idea may apply to coding agents. In chat, ICA prevents the model from answering before intent is resolved. In agents, ICA can preserve the original task intent while filtering tool-output noise, failed attempts, and conversational drift across many steps.</w:t>
+        <w:t>The same control-layer idea applies directly to coding agents. In chat, ICA prevents the model from answering before intent is resolved. In agents, ICA preserves the original task intent while filtering tool-output noise, failed attempts, and conversational drift across many steps.</w:t>
       </w:r>
     </w:p>
     <w:p>
       <w:r>
-        <w:t>In that framing, ICA becomes a control plane for agentic systems. It does not replace the model's reasoning or tool use; it governs the state the model should reason over: original goal, verified facts, current constraints, failed paths, and the next useful action.</w:t>
+        <w:t>In that framing, ICA is a control plane for agentic systems. It does not replace the model's reasoning or tool use; it governs the state the model should reason over: original goal, verified facts, current constraints, failed paths, and the next useful action.</w:t>
       </w:r>
     </w:p>
     <w:p>
@@ -965,7 +970,7 @@
     </w:p>
     <w:p>
       <w:r>
-        <w:t>This repository does not yet benchmark coding-agent performance. The extension is a natural, testable bridge from clarification-first chat to intent-preserving agent orchestration, with metrics such as tokens to green tests, repeated mistakes, time to resolution, final pass rate, unnecessary code churn, and preservation of original intent. If validated on coding-agent benchmarks, this could improve agent unit economics by reducing repeated context, failed loops, and intent drift.</w:t>
+        <w:t>This repository does not yet benchmark coding-agent performance. That is the next evidence step, not a separate idea. The bridge from clarification-first chat to intent-preserving agent orchestration is the same mechanism: compress the uncertainty, keep the load-bearing intent, and remove noise before the next model call. Useful metrics include tokens to green tests, repeated mistakes, time to resolution, final pass rate, unnecessary code churn, and preservation of original intent.</w:t>
       </w:r>
     </w:p>
     <w:p>
@@ -1001,7 +1006,7 @@
     </w:p>
     <w:p>
       <w:r>
-        <w:t>ICA is a credible architecture pattern because it defines a control-layer problem that engineers can implement: infer intent hypotheses, quantify ambiguity, route by expected utility, narrow intent before generation when doing so is worth the cost, and build systems that are more precise, more reliable, easier to defend, and often cheaper to operate once wrong-funnel conversations are counted properly.</w:t>
+        <w:t>ICA is a credible architecture pattern because it defines the missing control-layer problem engineers can implement: infer intent hypotheses, quantify ambiguity, route by expected utility, narrow intent before generation or action when doing so is worth the cost, and build systems that are more precise, more reliable, easier to defend, and often cheaper to operate once wrong-funnel conversations and wasted agent loops are counted properly.</w:t>
       </w:r>
     </w:p>
     <w:p>

</xml_diff>

<commit_message>
Elevate agentic workflow framing
</commit_message>
<xml_diff>
--- a/ICA_Engineering_Design_Proposal1.docx
+++ b/ICA_Engineering_Design_Proposal1.docx
@@ -169,6 +169,14 @@
     <w:p>
       <w:r>
         <w:t>ICA inserts a control layer between user input and final generation or action. The layer estimates likely intent hypotheses, scores ambiguity and risk, and decides whether clarification improves the expected outcome enough to justify the extra turn.</w:t>
+      </w:r>
+    </w:p>
+    <w:p>
+      <w:pPr>
+        <w:pStyle w:val="ICAHeading2"/>
+      </w:pPr>
+      <w:r>
+        <w:t>Agentic &amp; coding workflows</w:t>
       </w:r>
     </w:p>
     <w:p>

</xml_diff>